<commit_message>
Correct Zheng Zha clip as Infinite Horror manhua drama
</commit_message>
<xml_diff>
--- a/resume-lin-jiaqin.docx
+++ b/resume-lin-jiaqin.docx
@@ -72,7 +72,7 @@
           <w:color w:val="1A1A1A"/>
           <w:sz w:val="21"/>
         </w:rPr>
-        <w:t>2026 年浙江科技大学机器人工程本科毕业。在杭州天启映画担任 AIGC 视频设计师，完成真人短剧、职场短片和神话特效的分镜、角色/场景锚点、图生视频、剪映精剪、声音替换和成片交付。按镜头核对动作因果、视线匹配、遮挡穿模和跨段状态，把 bad case 回写到分镜与提示词。</w:t>
+        <w:t>2026 年浙江科技大学机器人工程本科毕业。在杭州天启映画担任 AIGC 视频设计师，完成真人短剧、小说改编漫剧和神话特效的分镜、角色/场景锚点、图生视频、剪映精剪、声音替换和成片交付。按镜头核对动作因果、视线匹配、遮挡穿模和跨段状态，把 bad case 回写到分镜与提示词。</w:t>
       </w:r>
     </w:p>
     <w:p>
@@ -146,7 +146,7 @@
           <w:color w:val="1A1A1A"/>
           <w:sz w:val="21"/>
         </w:rPr>
-        <w:t>完成真人短剧、职场短片和神话特效的分镜、锚点、图生视频、精剪与成片交付</w:t>
+        <w:t>完成真人短剧、小说改编漫剧和神话特效的分镜、锚点、图生视频、精剪与成片交付</w:t>
       </w:r>
     </w:p>
     <w:p>
@@ -301,7 +301,7 @@
           <w:color w:val="1A1A1A"/>
           <w:sz w:val="22"/>
         </w:rPr>
-        <w:t>职场反差短片  ·  真人短视频 / 剪辑</w:t>
+        <w:t>《无限恐怖》漫剧  ·  小说改编 CG / 分镜 / 图生视频</w:t>
       </w:r>
     </w:p>
     <w:p>
@@ -315,7 +315,7 @@
           <w:color w:val="555555"/>
           <w:sz w:val="20"/>
         </w:rPr>
-        <w:t>用同一人物的办公室日常与极端处境对切，做成可投放的剧情短片。</w:t>
+        <w:t>改编自 zhttty 小说《无限恐怖》，做第 1 集郑吒从公司被拉进主神轮回的开场。</w:t>
       </w:r>
     </w:p>
     <w:p>
@@ -331,7 +331,7 @@
           <w:color w:val="1A1A1A"/>
           <w:sz w:val="21"/>
         </w:rPr>
-        <w:t>设计人物关系、信息反差和反应镜头，完成角色参考、镜头提示词和 85 秒成片装配</w:t>
+        <w:t>锁定郑吒角色锚点，完成办公室开场到车厢醒来的分镜、提示词和 85 秒成片装配</w:t>
       </w:r>
     </w:p>
     <w:p>
@@ -347,7 +347,7 @@
           <w:color w:val="1A1A1A"/>
           <w:sz w:val="21"/>
         </w:rPr>
-        <w:t>检查表情是否由具体事件触发，核对眼神、手部动作、伤势连续性和对白节点</w:t>
+        <w:t>核对郑吒、张杰身份与伤势、车厢站位和跨段状态，避免串脸和空间翻转</w:t>
       </w:r>
     </w:p>
     <w:p>
@@ -363,7 +363,7 @@
           <w:color w:val="1A1A1A"/>
           <w:sz w:val="21"/>
         </w:rPr>
-        <w:t>用剪映完成精剪、字幕与成片输出，沉淀真人视频的反 AI 味检查项</w:t>
+        <w:t>用剪映完成精剪、字幕与成片输出</w:t>
       </w:r>
     </w:p>
     <w:p>

</xml_diff>

<commit_message>
Use professional shot terms; restore original resume structure
</commit_message>
<xml_diff>
--- a/resume-lin-jiaqin.docx
+++ b/resume-lin-jiaqin.docx
@@ -27,7 +27,7 @@
           <w:color w:val="8A6A32"/>
           <w:sz w:val="22"/>
         </w:rPr>
-        <w:t>AIGC 视频设计师</w:t>
+        <w:t>AIGC 视频设计师（全流程制作）</w:t>
       </w:r>
     </w:p>
     <w:p>
@@ -72,7 +72,88 @@
           <w:color w:val="1A1A1A"/>
           <w:sz w:val="21"/>
         </w:rPr>
-        <w:t>2026 年浙江科技大学机器人工程本科毕业。在杭州天启映画担任 AIGC 视频设计师，完成真人短剧、小说改编漫剧和神话特效的分镜、角色/场景锚点、图生视频、剪映精剪、声音替换和成片交付。按镜头核对动作因果、视线匹配、遮挡穿模和跨段状态，把 bad case 回写到分镜与提示词。</w:t>
+        <w:t>2026 年浙江科技大学机器人工程本科毕业。曾在杭州天启映画影视科技有限公司负责 AI 视频全流程制作：从剧本拆解、分镜与角色/场景参考图，到生成、声音替换、剪辑精修、字幕和交付。熟悉按镜头检查动作时序、运动轨迹、物理表现、遮挡与穿模、180°轴线、视线匹配、角色/场景一致性和音画同步，并把质量问题修正回分镜、提示词或后期时间线。</w:t>
+      </w:r>
+    </w:p>
+    <w:p>
+      <w:pPr>
+        <w:spacing w:before="200" w:after="80" w:line="320" w:lineRule="exact"/>
+        <w:pBdr>
+          <w:bottom w:val="single" w:sz="8" w:space="1" w:color="8A6A32"/>
+        </w:pBdr>
+      </w:pPr>
+      <w:r>
+        <w:rPr>
+          <w:rFonts w:ascii="Microsoft YaHei" w:hAnsi="Microsoft YaHei" w:eastAsia="Microsoft YaHei"/>
+          <w:b/>
+          <w:color w:val="8A6A32"/>
+          <w:sz w:val="22"/>
+        </w:rPr>
+        <w:t>核心技能</w:t>
+      </w:r>
+    </w:p>
+    <w:p>
+      <w:pPr>
+        <w:pStyle w:val="ListBullet"/>
+        <w:spacing w:before="0" w:after="40" w:line="320" w:lineRule="exact"/>
+        <w:ind w:left="312"/>
+      </w:pPr>
+      <w:r>
+        <w:rPr>
+          <w:rFonts w:ascii="Microsoft YaHei" w:hAnsi="Microsoft YaHei" w:eastAsia="Microsoft YaHei"/>
+          <w:b w:val="0"/>
+          <w:color w:val="1A1A1A"/>
+          <w:sz w:val="21"/>
+        </w:rPr>
+        <w:t>AI 视频全流程：剧本拆解、分镜设计、角色/场景参考图、提示词、图生视频/文生视频、生成工作流、版本管理、剪辑交付</w:t>
+      </w:r>
+    </w:p>
+    <w:p>
+      <w:pPr>
+        <w:pStyle w:val="ListBullet"/>
+        <w:spacing w:before="0" w:after="40" w:line="320" w:lineRule="exact"/>
+        <w:ind w:left="312"/>
+      </w:pPr>
+      <w:r>
+        <w:rPr>
+          <w:rFonts w:ascii="Microsoft YaHei" w:hAnsi="Microsoft YaHei" w:eastAsia="Microsoft YaHei"/>
+          <w:b w:val="0"/>
+          <w:color w:val="1A1A1A"/>
+          <w:sz w:val="21"/>
+        </w:rPr>
+        <w:t>画面与连续性：动作连续性、运动轨迹、动作因果、物理表现、遮挡与穿模、180°轴线、视线匹配、景别衔接、角色/场景一致性、音画同步</w:t>
+      </w:r>
+    </w:p>
+    <w:p>
+      <w:pPr>
+        <w:pStyle w:val="ListBullet"/>
+        <w:spacing w:before="0" w:after="40" w:line="320" w:lineRule="exact"/>
+        <w:ind w:left="312"/>
+      </w:pPr>
+      <w:r>
+        <w:rPr>
+          <w:rFonts w:ascii="Microsoft YaHei" w:hAnsi="Microsoft YaHei" w:eastAsia="Microsoft YaHei"/>
+          <w:b w:val="0"/>
+          <w:color w:val="1A1A1A"/>
+          <w:sz w:val="21"/>
+        </w:rPr>
+        <w:t>后期制作：剪映专业版、FFmpeg、精剪、J 剪/L 剪、声音替换、音量包络、字幕、基础调色、编码导出</w:t>
+      </w:r>
+    </w:p>
+    <w:p>
+      <w:pPr>
+        <w:pStyle w:val="ListBullet"/>
+        <w:spacing w:before="0" w:after="40" w:line="320" w:lineRule="exact"/>
+        <w:ind w:left="312"/>
+      </w:pPr>
+      <w:r>
+        <w:rPr>
+          <w:rFonts w:ascii="Microsoft YaHei" w:hAnsi="Microsoft YaHei" w:eastAsia="Microsoft YaHei"/>
+          <w:b w:val="0"/>
+          <w:color w:val="1A1A1A"/>
+          <w:sz w:val="21"/>
+        </w:rPr>
+        <w:t>制作协作：Python、JSON/JSONL、Markdown；3—4 人小组任务拆分、镜头交叉复核和版本交付</w:t>
       </w:r>
     </w:p>
     <w:p>
@@ -95,7 +176,7 @@
     <w:p>
       <w:pPr>
         <w:tabs>
-          <w:tab w:pos="9865" w:val="right"/>
+          <w:tab w:pos="9978" w:val="right"/>
         </w:tabs>
         <w:spacing w:before="120" w:after="20" w:line="320" w:lineRule="exact"/>
       </w:pPr>
@@ -130,7 +211,7 @@
           <w:color w:val="555555"/>
           <w:sz w:val="20"/>
         </w:rPr>
-        <w:t>AIGC 视频设计师  ·  杭州</w:t>
+        <w:t>AIGC 视频设计师（全流程制作）  ·  杭州</w:t>
       </w:r>
     </w:p>
     <w:p>
@@ -146,7 +227,7 @@
           <w:color w:val="1A1A1A"/>
           <w:sz w:val="21"/>
         </w:rPr>
-        <w:t>完成真人短剧、小说改编漫剧和神话特效的分镜、锚点、图生视频、精剪与成片交付</w:t>
+        <w:t>负责 AI 视频从剧本拆解、分镜设计、参考图、提示词、生成测试到剪辑、声音替换、字幕和成片导出的完整流程</w:t>
       </w:r>
     </w:p>
     <w:p>
@@ -162,7 +243,7 @@
           <w:color w:val="1A1A1A"/>
           <w:sz w:val="21"/>
         </w:rPr>
-        <w:t>按镜头核对朝向、视线、伤势/服装和跨段接续，把穿模、对象错位和状态重置回写到提示词</w:t>
+        <w:t>面向真人短剧、剧情漫剧和特效视频，检查人物朝向、视线对象、动作先后、道具状态、遮挡关系、镜头轴线和跨场连续性</w:t>
       </w:r>
     </w:p>
     <w:p>
@@ -178,7 +259,7 @@
           <w:color w:val="1A1A1A"/>
           <w:sz w:val="21"/>
         </w:rPr>
-        <w:t>用剪映专业版与 FFmpeg 完成精剪、声音替换、字幕和导出，统一镜头命名与版本回传</w:t>
+        <w:t>使用剪映专业版与 FFmpeg 完成素材整理、精剪、音画对齐、字幕、转场和交付编码；结合逐帧检查、时长和音频参数定位问题</w:t>
       </w:r>
     </w:p>
     <w:p>
@@ -194,7 +275,7 @@
           <w:color w:val="1A1A1A"/>
           <w:sz w:val="21"/>
         </w:rPr>
-        <w:t>参与原创漫剧《抵命新娘》EP1—EP5 的剧本拆解、分镜、生成与精剪装配</w:t>
+        <w:t>在 3—4 人团队中参与任务拆分和交叉质检，统一镜头命名、素材版本和问题反馈格式</w:t>
       </w:r>
     </w:p>
     <w:p>
@@ -211,7 +292,7 @@
           <w:color w:val="8A6A32"/>
           <w:sz w:val="22"/>
         </w:rPr>
-        <w:t>项目经历</w:t>
+        <w:t>代表项目</w:t>
       </w:r>
     </w:p>
     <w:p>
@@ -225,21 +306,7 @@
           <w:color w:val="1A1A1A"/>
           <w:sz w:val="22"/>
         </w:rPr>
-        <w:t>《狂猎》真人短剧  ·  分镜 / 图生视频 / 连续性</w:t>
-      </w:r>
-    </w:p>
-    <w:p>
-      <w:pPr>
-        <w:spacing w:before="0" w:after="40" w:line="320" w:lineRule="exact"/>
-      </w:pPr>
-      <w:r>
-        <w:rPr>
-          <w:rFonts w:ascii="Microsoft YaHei" w:hAnsi="Microsoft YaHei" w:eastAsia="Microsoft YaHei"/>
-          <w:b w:val="0"/>
-          <w:color w:val="555555"/>
-          <w:sz w:val="20"/>
-        </w:rPr>
-        <w:t>面向真人谍战短剧，解决 AI 生成中人物身份、视线和跨段状态漂移的问题。</w:t>
+        <w:t>《狂猎》真人短剧  ·  分镜设计 / 图生视频 / 连续性</w:t>
       </w:r>
     </w:p>
     <w:p>
@@ -255,7 +322,7 @@
           <w:color w:val="1A1A1A"/>
           <w:sz w:val="21"/>
         </w:rPr>
-        <w:t>设计场景 41 的 79 刀分镜、44 段台词，绑定 2 个角色锚点与 1 个场景锚点</w:t>
+        <w:t>完成第 41 场 79 个镜头、44 段对白的分镜设计，并建立 2 个角色与 1 个场景的参考图</w:t>
       </w:r>
     </w:p>
     <w:p>
@@ -271,7 +338,7 @@
           <w:color w:val="1A1A1A"/>
           <w:sz w:val="21"/>
         </w:rPr>
-        <w:t>将长台词拆为可生成 montage 段，逐镜核对动作因果、视线方向、前景遮挡和权力调度</w:t>
+        <w:t>将长对白拆成可生成的镜头段落，保留对白覆盖；逐镜检查动作因果、视线方向、前景遮挡、场面调度和跨场连续性</w:t>
       </w:r>
     </w:p>
     <w:p>
@@ -287,7 +354,7 @@
           <w:color w:val="1A1A1A"/>
           <w:sz w:val="21"/>
         </w:rPr>
-        <w:t>用抽帧双审和守轴检查定位穿模、对话对象错位与状态重置，回写镜头设计</w:t>
+        <w:t>通过轴线、空间关系和成片逐帧检查，定位穿模、对象错位与状态重置，并修正分镜与提示词</w:t>
       </w:r>
     </w:p>
     <w:p>
@@ -301,21 +368,7 @@
           <w:color w:val="1A1A1A"/>
           <w:sz w:val="22"/>
         </w:rPr>
-        <w:t>《无限恐怖》漫剧  ·  小说改编 CG / 分镜 / 图生视频</w:t>
-      </w:r>
-    </w:p>
-    <w:p>
-      <w:pPr>
-        <w:spacing w:before="0" w:after="40" w:line="320" w:lineRule="exact"/>
-      </w:pPr>
-      <w:r>
-        <w:rPr>
-          <w:rFonts w:ascii="Microsoft YaHei" w:hAnsi="Microsoft YaHei" w:eastAsia="Microsoft YaHei"/>
-          <w:b w:val="0"/>
-          <w:color w:val="555555"/>
-          <w:sz w:val="20"/>
-        </w:rPr>
-        <w:t>改编自 zhttty 小说《无限恐怖》，做第 1 集郑吒从公司被拉进主神轮回的开场。</w:t>
+        <w:t>《无限恐怖》漫剧  ·  小说改编 / 分镜 / 图生视频</w:t>
       </w:r>
     </w:p>
     <w:p>
@@ -331,7 +384,7 @@
           <w:color w:val="1A1A1A"/>
           <w:sz w:val="21"/>
         </w:rPr>
-        <w:t>锁定郑吒角色锚点，完成办公室开场到车厢醒来的分镜、提示词和 85 秒成片装配</w:t>
+        <w:t>改编同名小说第 1 集开场：郑吒从办公室进入主神轮回，完成角色参考图、分镜、提示词与成片</w:t>
       </w:r>
     </w:p>
     <w:p>
@@ -347,7 +400,7 @@
           <w:color w:val="1A1A1A"/>
           <w:sz w:val="21"/>
         </w:rPr>
-        <w:t>核对郑吒、张杰身份与伤势、车厢站位和跨段状态，避免串脸和空间翻转</w:t>
+        <w:t>核对郑吒、张杰的人物形象、伤势、车厢站位和跨场连续性，避免角色形象不一致和空间方向错误</w:t>
       </w:r>
     </w:p>
     <w:p>
@@ -363,7 +416,69 @@
           <w:color w:val="1A1A1A"/>
           <w:sz w:val="21"/>
         </w:rPr>
-        <w:t>用剪映完成精剪、字幕与成片输出</w:t>
+        <w:t>使用剪映专业版完成精剪、字幕与成片输出</w:t>
+      </w:r>
+    </w:p>
+    <w:p>
+      <w:pPr>
+        <w:spacing w:before="140" w:after="20" w:line="320" w:lineRule="exact"/>
+      </w:pPr>
+      <w:r>
+        <w:rPr>
+          <w:rFonts w:ascii="Microsoft YaHei" w:hAnsi="Microsoft YaHei" w:eastAsia="Microsoft YaHei"/>
+          <w:b/>
+          <w:color w:val="1A1A1A"/>
+          <w:sz w:val="22"/>
+        </w:rPr>
+        <w:t>《抵命新娘》原创漫剧  ·  分镜、生成与后期精剪</w:t>
+      </w:r>
+    </w:p>
+    <w:p>
+      <w:pPr>
+        <w:pStyle w:val="ListBullet"/>
+        <w:spacing w:before="0" w:after="40" w:line="320" w:lineRule="exact"/>
+        <w:ind w:left="312"/>
+      </w:pPr>
+      <w:r>
+        <w:rPr>
+          <w:rFonts w:ascii="Microsoft YaHei" w:hAnsi="Microsoft YaHei" w:eastAsia="Microsoft YaHei"/>
+          <w:b w:val="0"/>
+          <w:color w:val="1A1A1A"/>
+          <w:sz w:val="21"/>
+        </w:rPr>
+        <w:t>参与 EP1—EP5 的剧本拆解、分镜设计、AI 视频生成、版本管理和成片装配</w:t>
+      </w:r>
+    </w:p>
+    <w:p>
+      <w:pPr>
+        <w:pStyle w:val="ListBullet"/>
+        <w:spacing w:before="0" w:after="40" w:line="320" w:lineRule="exact"/>
+        <w:ind w:left="312"/>
+      </w:pPr>
+      <w:r>
+        <w:rPr>
+          <w:rFonts w:ascii="Microsoft YaHei" w:hAnsi="Microsoft YaHei" w:eastAsia="Microsoft YaHei"/>
+          <w:b w:val="0"/>
+          <w:color w:val="1A1A1A"/>
+          <w:sz w:val="21"/>
+        </w:rPr>
+        <w:t>按段落组织人物关系、信息揭示、视线和节奏，逐段核对人物状态、道具连续性、镜头衔接和对白时长</w:t>
+      </w:r>
+    </w:p>
+    <w:p>
+      <w:pPr>
+        <w:pStyle w:val="ListBullet"/>
+        <w:spacing w:before="0" w:after="40" w:line="320" w:lineRule="exact"/>
+        <w:ind w:left="312"/>
+      </w:pPr>
+      <w:r>
+        <w:rPr>
+          <w:rFonts w:ascii="Microsoft YaHei" w:hAnsi="Microsoft YaHei" w:eastAsia="Microsoft YaHei"/>
+          <w:b w:val="0"/>
+          <w:color w:val="1A1A1A"/>
+          <w:sz w:val="21"/>
+        </w:rPr>
+        <w:t>使用剪映/FFmpeg 完成素材拼接、精剪、字幕、配乐/环境声、调色和多版本导出</w:t>
       </w:r>
     </w:p>
     <w:p>
@@ -382,16 +497,18 @@
     </w:p>
     <w:p>
       <w:pPr>
+        <w:pStyle w:val="ListBullet"/>
         <w:spacing w:before="0" w:after="40" w:line="320" w:lineRule="exact"/>
+        <w:ind w:left="312"/>
       </w:pPr>
       <w:r>
         <w:rPr>
           <w:rFonts w:ascii="Microsoft YaHei" w:hAnsi="Microsoft YaHei" w:eastAsia="Microsoft YaHei"/>
           <w:b w:val="0"/>
-          <w:color w:val="555555"/>
-          <w:sz w:val="20"/>
+          <w:color w:val="1A1A1A"/>
+          <w:sz w:val="21"/>
         </w:rPr>
-        <w:t>面向神话动作展示，解决特效主体绑不牢、命中瞬间无力和景别偏平的问题。</w:t>
+        <w:t>制作混天绫缠绕、火柱落地和法宝命中段，按特效主体、动作密度、景别起伏、命中瞬间和空间纵深组织镜头</w:t>
       </w:r>
     </w:p>
     <w:p>
@@ -407,7 +524,7 @@
           <w:color w:val="1A1A1A"/>
           <w:sz w:val="21"/>
         </w:rPr>
-        <w:t>制作混天绫缠绕、火柱落地和法宝命中段，按主体绑定、动作密度和景别起伏组织镜头</w:t>
+        <w:t>将特效问题拆为参考图、镜头容量、动作时序、物理表现和后期拼接，用提示词审查、逐帧检查与版本对比定位原因</w:t>
       </w:r>
     </w:p>
     <w:p>
@@ -423,104 +540,7 @@
           <w:color w:val="1A1A1A"/>
           <w:sz w:val="21"/>
         </w:rPr>
-        <w:t>将问题拆为参考资产、镜头容纳、动作时序、物理表现和后期拼接，用抽帧对比定位根因</w:t>
-      </w:r>
-    </w:p>
-    <w:p>
-      <w:pPr>
-        <w:pStyle w:val="ListBullet"/>
-        <w:spacing w:before="0" w:after="40" w:line="320" w:lineRule="exact"/>
-        <w:ind w:left="312"/>
-      </w:pPr>
-      <w:r>
-        <w:rPr>
-          <w:rFonts w:ascii="Microsoft YaHei" w:hAnsi="Microsoft YaHei" w:eastAsia="Microsoft YaHei"/>
-          <w:b w:val="0"/>
-          <w:color w:val="1A1A1A"/>
-          <w:sz w:val="21"/>
-        </w:rPr>
-        <w:t>产出 44 秒 1080p 动作段，保留可复用的动作设计、生成脚本和审查记录</w:t>
-      </w:r>
-    </w:p>
-    <w:p>
-      <w:pPr>
-        <w:spacing w:before="200" w:after="80" w:line="320" w:lineRule="exact"/>
-        <w:pBdr>
-          <w:bottom w:val="single" w:sz="8" w:space="1" w:color="8A6A32"/>
-        </w:pBdr>
-      </w:pPr>
-      <w:r>
-        <w:rPr>
-          <w:rFonts w:ascii="Microsoft YaHei" w:hAnsi="Microsoft YaHei" w:eastAsia="Microsoft YaHei"/>
-          <w:b/>
-          <w:color w:val="8A6A32"/>
-          <w:sz w:val="22"/>
-        </w:rPr>
-        <w:t>核心技能</w:t>
-      </w:r>
-    </w:p>
-    <w:p>
-      <w:pPr>
-        <w:pStyle w:val="ListBullet"/>
-        <w:spacing w:before="0" w:after="40" w:line="320" w:lineRule="exact"/>
-        <w:ind w:left="312"/>
-      </w:pPr>
-      <w:r>
-        <w:rPr>
-          <w:rFonts w:ascii="Microsoft YaHei" w:hAnsi="Microsoft YaHei" w:eastAsia="Microsoft YaHei"/>
-          <w:b w:val="0"/>
-          <w:color w:val="1A1A1A"/>
-          <w:sz w:val="21"/>
-        </w:rPr>
-        <w:t>AI 视频：剧本拆解、逐镜分镜、角色/场景锚点、提示词、图生视频、文生视频、RunningHub / H3</w:t>
-      </w:r>
-    </w:p>
-    <w:p>
-      <w:pPr>
-        <w:pStyle w:val="ListBullet"/>
-        <w:spacing w:before="0" w:after="40" w:line="320" w:lineRule="exact"/>
-        <w:ind w:left="312"/>
-      </w:pPr>
-      <w:r>
-        <w:rPr>
-          <w:rFonts w:ascii="Microsoft YaHei" w:hAnsi="Microsoft YaHei" w:eastAsia="Microsoft YaHei"/>
-          <w:b w:val="0"/>
-          <w:color w:val="1A1A1A"/>
-          <w:sz w:val="21"/>
-        </w:rPr>
-        <w:t>后期制作：剪映专业版、FFmpeg、精剪、声音替换、字幕、调色、编码导出</w:t>
-      </w:r>
-    </w:p>
-    <w:p>
-      <w:pPr>
-        <w:pStyle w:val="ListBullet"/>
-        <w:spacing w:before="0" w:after="40" w:line="320" w:lineRule="exact"/>
-        <w:ind w:left="312"/>
-      </w:pPr>
-      <w:r>
-        <w:rPr>
-          <w:rFonts w:ascii="Microsoft YaHei" w:hAnsi="Microsoft YaHei" w:eastAsia="Microsoft YaHei"/>
-          <w:b w:val="0"/>
-          <w:color w:val="1A1A1A"/>
-          <w:sz w:val="21"/>
-        </w:rPr>
-        <w:t>视频评测：动作连续性、180°轴线、视线匹配、遮挡/穿模、角色与场景一致性、音画同步</w:t>
-      </w:r>
-    </w:p>
-    <w:p>
-      <w:pPr>
-        <w:pStyle w:val="ListBullet"/>
-        <w:spacing w:before="0" w:after="40" w:line="320" w:lineRule="exact"/>
-        <w:ind w:left="312"/>
-      </w:pPr>
-      <w:r>
-        <w:rPr>
-          <w:rFonts w:ascii="Microsoft YaHei" w:hAnsi="Microsoft YaHei" w:eastAsia="Microsoft YaHei"/>
-          <w:b w:val="0"/>
-          <w:color w:val="1A1A1A"/>
-          <w:sz w:val="21"/>
-        </w:rPr>
-        <w:t>协作工具：Python、JSON / JSONL、Markdown 评测报告</w:t>
+        <w:t>产出可复用的动作段设计、生成记录和后期素材</w:t>
       </w:r>
     </w:p>
     <w:p>
@@ -543,7 +563,7 @@
     <w:p>
       <w:pPr>
         <w:tabs>
-          <w:tab w:pos="9865" w:val="right"/>
+          <w:tab w:pos="9978" w:val="right"/>
         </w:tabs>
         <w:spacing w:before="120" w:after="20" w:line="320" w:lineRule="exact"/>
       </w:pPr>
@@ -583,7 +603,7 @@
     </w:p>
     <w:sectPr>
       <w:pgSz w:w="11906" w:h="16838"/>
-      <w:pgMar w:top="680" w:right="907" w:bottom="652" w:left="907" w:header="720" w:footer="720" w:gutter="0"/>
+      <w:pgMar w:top="652" w:right="850" w:bottom="624" w:left="850" w:header="720" w:footer="720" w:gutter="0"/>
       <w:cols w:space="720"/>
       <w:docGrid w:linePitch="360"/>
     </w:sectPr>

</xml_diff>

<commit_message>
Update resume with Cursor Claude Code Codex
</commit_message>
<xml_diff>
--- a/resume-lin-jiaqin.docx
+++ b/resume-lin-jiaqin.docx
@@ -72,7 +72,7 @@
           <w:color w:val="1A1A1A"/>
           <w:sz w:val="21"/>
         </w:rPr>
-        <w:t>2026 年浙江科技大学机器人工程本科毕业。曾在杭州天启映画影视科技有限公司负责 AI 视频全流程制作：从剧本拆解、分镜与角色/场景参考图，到生成、声音替换、剪辑精修、字幕和交付。熟悉按镜头检查动作时序、运动轨迹、物理表现、遮挡与穿模、180°轴线、视线匹配、角色/场景一致性和音画同步，并把质量问题修正回分镜、提示词或后期时间线。</w:t>
+        <w:t>2026 年浙江科技大学机器人工程本科毕业。曾在杭州天启映画影视科技有限公司负责 AI 视频全流程制作：从剧本拆解、分镜与角色/场景参考图，到生成、声音替换、剪辑精修、字幕和交付。日常使用 Cursor、Claude Code、Codex 完成分镜拆解、提示词修改和交付核对，并以 DeepSeek 做独立复核。熟悉按镜头检查动作时序、运动轨迹、物理表现、遮挡与穿模、180°轴线、视线匹配、角色/场景一致性和音画同步，并把质量问题修正回分镜、提示词或后期时间线。</w:t>
       </w:r>
     </w:p>
     <w:p>
@@ -105,7 +105,39 @@
           <w:color w:val="1A1A1A"/>
           <w:sz w:val="21"/>
         </w:rPr>
-        <w:t>AI 视频全流程：剧本拆解、分镜设计、角色/场景参考图、提示词、图生视频/文生视频、生成工作流、版本管理、剪辑交付</w:t>
+        <w:t>AI 视频全流程：剧本拆解、分镜设计、角色/场景参考图、提示词、图生视频/文生视频、版本管理、剪辑交付</w:t>
+      </w:r>
+    </w:p>
+    <w:p>
+      <w:pPr>
+        <w:pStyle w:val="ListBullet"/>
+        <w:spacing w:before="0" w:after="40" w:line="320" w:lineRule="exact"/>
+        <w:ind w:left="312"/>
+      </w:pPr>
+      <w:r>
+        <w:rPr>
+          <w:rFonts w:ascii="Microsoft YaHei" w:hAnsi="Microsoft YaHei" w:eastAsia="Microsoft YaHei"/>
+          <w:b w:val="0"/>
+          <w:color w:val="1A1A1A"/>
+          <w:sz w:val="21"/>
+        </w:rPr>
+        <w:t>生成工具：Seedance、Seedream、RunningHub</w:t>
+      </w:r>
+    </w:p>
+    <w:p>
+      <w:pPr>
+        <w:pStyle w:val="ListBullet"/>
+        <w:spacing w:before="0" w:after="40" w:line="320" w:lineRule="exact"/>
+        <w:ind w:left="312"/>
+      </w:pPr>
+      <w:r>
+        <w:rPr>
+          <w:rFonts w:ascii="Microsoft YaHei" w:hAnsi="Microsoft YaHei" w:eastAsia="Microsoft YaHei"/>
+          <w:b w:val="0"/>
+          <w:color w:val="1A1A1A"/>
+          <w:sz w:val="21"/>
+        </w:rPr>
+        <w:t>智能体协作：Cursor、Claude Code、Codex、DeepSeek</w:t>
       </w:r>
     </w:p>
     <w:p>
@@ -137,7 +169,7 @@
           <w:color w:val="1A1A1A"/>
           <w:sz w:val="21"/>
         </w:rPr>
-        <w:t>后期制作：剪映专业版、FFmpeg、精剪、J 剪/L 剪、声音替换、音量包络、字幕、基础调色、编码导出</w:t>
+        <w:t>后期制作：剪映专业版、FFmpeg、精剪、J-cut / L-cut、声音替换、音量包络、字幕、基础调色、编码导出</w:t>
       </w:r>
     </w:p>
     <w:p>
@@ -153,7 +185,7 @@
           <w:color w:val="1A1A1A"/>
           <w:sz w:val="21"/>
         </w:rPr>
-        <w:t>制作协作：Python、JSON/JSONL、Markdown；3—4 人小组任务拆分、镜头交叉复核和版本交付</w:t>
+        <w:t>制作协作：Python、JSON / JSONL、Markdown；3—4 人小组任务拆分、镜头交叉复核和版本交付</w:t>
       </w:r>
     </w:p>
     <w:p>
@@ -244,6 +276,22 @@
           <w:sz w:val="21"/>
         </w:rPr>
         <w:t>面向真人短剧、剧情漫剧和特效视频，检查人物朝向、视线对象、动作先后、道具状态、遮挡关系、镜头轴线和跨场连续性</w:t>
+      </w:r>
+    </w:p>
+    <w:p>
+      <w:pPr>
+        <w:pStyle w:val="ListBullet"/>
+        <w:spacing w:before="0" w:after="40" w:line="320" w:lineRule="exact"/>
+        <w:ind w:left="312"/>
+      </w:pPr>
+      <w:r>
+        <w:rPr>
+          <w:rFonts w:ascii="Microsoft YaHei" w:hAnsi="Microsoft YaHei" w:eastAsia="Microsoft YaHei"/>
+          <w:b w:val="0"/>
+          <w:color w:val="1A1A1A"/>
+          <w:sz w:val="21"/>
+        </w:rPr>
+        <w:t>使用 Cursor、Claude Code、Codex 完成分镜拆解、脚本编写、提示词修改和交付核对，并以 DeepSeek 复核镜头逻辑与空间关系</w:t>
       </w:r>
     </w:p>
     <w:p>
@@ -416,7 +464,7 @@
           <w:color w:val="1A1A1A"/>
           <w:sz w:val="21"/>
         </w:rPr>
-        <w:t>使用剪映专业版完成精剪、字幕与成片输出</w:t>
+        <w:t>使用 Seedance、剪映专业版完成生成、精剪、字幕与成片输出</w:t>
       </w:r>
     </w:p>
     <w:p>
@@ -478,7 +526,7 @@
           <w:color w:val="1A1A1A"/>
           <w:sz w:val="21"/>
         </w:rPr>
-        <w:t>使用剪映/FFmpeg 完成素材拼接、精剪、字幕、配乐/环境声、调色和多版本导出</w:t>
+        <w:t>使用剪映专业版 / FFmpeg 完成素材拼接、精剪、字幕、配乐/环境声、调色和多版本导出</w:t>
       </w:r>
     </w:p>
     <w:p>
@@ -524,7 +572,7 @@
           <w:color w:val="1A1A1A"/>
           <w:sz w:val="21"/>
         </w:rPr>
-        <w:t>将特效问题拆为参考图、镜头容量、动作时序、物理表现和后期拼接，用提示词审查、逐帧检查与版本对比定位原因</w:t>
+        <w:t>将特效问题拆为参考图、镜头覆盖、动作时序、物理表现和后期拼接，用提示词审查、逐帧检查与版本对比定位原因</w:t>
       </w:r>
     </w:p>
     <w:p>
@@ -541,6 +589,87 @@
           <w:sz w:val="21"/>
         </w:rPr>
         <w:t>产出可复用的动作段设计、生成记录和后期素材</w:t>
+      </w:r>
+    </w:p>
+    <w:p>
+      <w:pPr>
+        <w:spacing w:before="200" w:after="80" w:line="320" w:lineRule="exact"/>
+        <w:pBdr>
+          <w:bottom w:val="single" w:sz="8" w:space="1" w:color="8A6A32"/>
+        </w:pBdr>
+      </w:pPr>
+      <w:r>
+        <w:rPr>
+          <w:rFonts w:ascii="Microsoft YaHei" w:hAnsi="Microsoft YaHei" w:eastAsia="Microsoft YaHei"/>
+          <w:b/>
+          <w:color w:val="8A6A32"/>
+          <w:sz w:val="22"/>
+        </w:rPr>
+        <w:t>智能体与生成工具</w:t>
+      </w:r>
+    </w:p>
+    <w:p>
+      <w:pPr>
+        <w:pStyle w:val="ListBullet"/>
+        <w:spacing w:before="0" w:after="40" w:line="320" w:lineRule="exact"/>
+        <w:ind w:left="312"/>
+      </w:pPr>
+      <w:r>
+        <w:rPr>
+          <w:rFonts w:ascii="Microsoft YaHei" w:hAnsi="Microsoft YaHei" w:eastAsia="Microsoft YaHei"/>
+          <w:b w:val="0"/>
+          <w:color w:val="1A1A1A"/>
+          <w:sz w:val="21"/>
+        </w:rPr>
+        <w:t>Cursor、Claude Code、Codex：项目文件管理、剧本/分镜拆解、脚本编写、提示词修改、报告生成和交付核对</w:t>
+      </w:r>
+    </w:p>
+    <w:p>
+      <w:pPr>
+        <w:pStyle w:val="ListBullet"/>
+        <w:spacing w:before="0" w:after="40" w:line="320" w:lineRule="exact"/>
+        <w:ind w:left="312"/>
+      </w:pPr>
+      <w:r>
+        <w:rPr>
+          <w:rFonts w:ascii="Microsoft YaHei" w:hAnsi="Microsoft YaHei" w:eastAsia="Microsoft YaHei"/>
+          <w:b w:val="0"/>
+          <w:color w:val="1A1A1A"/>
+          <w:sz w:val="21"/>
+        </w:rPr>
+        <w:t>DeepSeek：独立复核提示词、镜头逻辑和空间关系</w:t>
+      </w:r>
+    </w:p>
+    <w:p>
+      <w:pPr>
+        <w:pStyle w:val="ListBullet"/>
+        <w:spacing w:before="0" w:after="40" w:line="320" w:lineRule="exact"/>
+        <w:ind w:left="312"/>
+      </w:pPr>
+      <w:r>
+        <w:rPr>
+          <w:rFonts w:ascii="Microsoft YaHei" w:hAnsi="Microsoft YaHei" w:eastAsia="Microsoft YaHei"/>
+          <w:b w:val="0"/>
+          <w:color w:val="1A1A1A"/>
+          <w:sz w:val="21"/>
+        </w:rPr>
+        <w:t>Seedance、Seedream、RunningHub：参考图、图生视频/文生视频、参数配置、任务管理与成片下载</w:t>
+      </w:r>
+    </w:p>
+    <w:p>
+      <w:pPr>
+        <w:pStyle w:val="ListBullet"/>
+        <w:spacing w:before="0" w:after="40" w:line="320" w:lineRule="exact"/>
+        <w:ind w:left="312"/>
+      </w:pPr>
+      <w:r>
+        <w:rPr>
+          <w:rFonts w:ascii="Microsoft YaHei" w:hAnsi="Microsoft YaHei" w:eastAsia="Microsoft YaHei"/>
+          <w:b w:val="0"/>
+          <w:color w:val="1A1A1A"/>
+          <w:sz w:val="21"/>
+        </w:rPr>
+        <w:t>剪映专业版、FFmpeg：精剪、声音替换、字幕、编码导出</w:t>
       </w:r>
     </w:p>
     <w:p>

</xml_diff>